<commit_message>
Fixed doctype and associated files
</commit_message>
<xml_diff>
--- a/flower_backend/doctypes/FA.docx
+++ b/flower_backend/doctypes/FA.docx
@@ -583,7 +583,17 @@
                 <w:szCs w:val="18"/>
                 <w:lang w:val="fr-FR"/>
               </w:rPr>
-              <w:t>A l’attention de :</w:t>
+              <w:t>À</w:t>
+            </w:r>
+            <w:r>
+              <w:rPr>
+                <w:rFonts w:ascii="Arial" w:hAnsi="Arial"/>
+                <w:color w:val="808080"/>
+                <w:sz w:val="18"/>
+                <w:szCs w:val="18"/>
+                <w:lang w:val="fr-FR"/>
+              </w:rPr>
+              <w:t xml:space="preserve"> l’attention de :</w:t>
             </w:r>
           </w:p>
           <w:p>
@@ -2468,6 +2478,7 @@
           <w:p>
             <w:pPr>
               <w:pStyle w:val="Standard"/>
+              <w:jc w:val="both"/>
               <w:rPr>
                 <w:rFonts w:ascii="Arial" w:hAnsi="Arial"/>
                 <w:color w:val="555555"/>
@@ -2485,11 +2496,22 @@
                 <w:lang w:val="fr-FR"/>
               </w:rPr>
               <w:t>Aucun escompte n'est accordé pour paiement anticipé</w:t>
+            </w:r>
+            <w:r>
+              <w:rPr>
+                <w:rFonts w:ascii="Arial" w:hAnsi="Arial"/>
+                <w:color w:val="555555"/>
+                <w:sz w:val="16"/>
+                <w:szCs w:val="18"/>
+                <w:lang w:val="fr-FR"/>
+              </w:rPr>
+              <w:t>.</w:t>
             </w:r>
           </w:p>
           <w:p>
             <w:pPr>
               <w:pStyle w:val="Standard"/>
+              <w:jc w:val="both"/>
               <w:rPr>
                 <w:rFonts w:ascii="Arial" w:hAnsi="Arial"/>
                 <w:color w:val="555555"/>
@@ -2508,10 +2530,53 @@
               </w:rPr>
               <w:t>Tout règlement effectué après la date d'échéance figurant sur la facture pourra</w:t>
             </w:r>
+            <w:r>
+              <w:rPr>
+                <w:rFonts w:ascii="Arial" w:hAnsi="Arial"/>
+                <w:color w:val="555555"/>
+                <w:sz w:val="16"/>
+                <w:szCs w:val="16"/>
+                <w:lang w:val="fr-FR"/>
+              </w:rPr>
+              <w:t xml:space="preserve"> </w:t>
+            </w:r>
+            <w:r>
+              <w:rPr>
+                <w:rFonts w:ascii="Arial" w:hAnsi="Arial"/>
+                <w:color w:val="555555"/>
+                <w:sz w:val="16"/>
+                <w:szCs w:val="16"/>
+                <w:lang w:val="fr-FR"/>
+              </w:rPr>
+              <w:t>entrainer de plein droit des pénalités de retard calculées sur la base du taux</w:t>
+            </w:r>
+            <w:r>
+              <w:rPr>
+                <w:rFonts w:ascii="Arial" w:hAnsi="Arial"/>
+                <w:color w:val="555555"/>
+                <w:sz w:val="16"/>
+                <w:szCs w:val="16"/>
+                <w:lang w:val="fr-FR"/>
+              </w:rPr>
+              <w:t xml:space="preserve"> </w:t>
+            </w:r>
+            <w:r>
+              <w:rPr>
+                <w:rFonts w:ascii="Arial" w:hAnsi="Arial"/>
+                <w:color w:val="555555"/>
+                <w:sz w:val="16"/>
+                <w:szCs w:val="16"/>
+                <w:lang w:val="fr-FR"/>
+              </w:rPr>
+              <w:t>d'intérêt légal en vigueur majoré de 10 points de pourcentage (appliqué au montant TTC). Et en application des articles L441-3 et L441-6 du code de commerce, il sera également appliqué une indemnité de recouvrement de 40 euros.</w:t>
+            </w:r>
+            <w:bookmarkStart w:id="0" w:name="_GoBack"/>
+            <w:bookmarkEnd w:id="0"/>
           </w:p>
           <w:p>
             <w:pPr>
               <w:pStyle w:val="Standard"/>
+              <w:jc w:val="both"/>
               <w:rPr>
                 <w:rFonts w:ascii="Arial" w:hAnsi="Arial"/>
                 <w:color w:val="555555"/>
@@ -2528,56 +2593,13 @@
                 <w:szCs w:val="16"/>
                 <w:lang w:val="fr-FR"/>
               </w:rPr>
-              <w:t>entrainer de plein droit des pénalités de retard calculées sur la base du taux</w:t>
+              <w:t>Cette pénalité court à compter de la date d'échéance jusqu'au jour du paiement</w:t>
             </w:r>
           </w:p>
           <w:p>
             <w:pPr>
               <w:pStyle w:val="Standard"/>
-              <w:rPr>
-                <w:rFonts w:ascii="Arial" w:hAnsi="Arial"/>
-                <w:color w:val="555555"/>
-                <w:sz w:val="16"/>
-                <w:szCs w:val="16"/>
-                <w:lang w:val="fr-FR"/>
-              </w:rPr>
-            </w:pPr>
-            <w:r>
-              <w:rPr>
-                <w:rFonts w:ascii="Arial" w:hAnsi="Arial"/>
-                <w:color w:val="555555"/>
-                <w:sz w:val="16"/>
-                <w:szCs w:val="16"/>
-                <w:lang w:val="fr-FR"/>
-              </w:rPr>
-              <w:t>d'intérêt légal en vigueur majoré de 10 points de pourcentage (appliqué au montant TTC). Et en application des articles L441-3 et L441-6 du code de commerce, il sera également appliqué une indemnité de recouvrement de 40 euros.</w:t>
-            </w:r>
-          </w:p>
-          <w:p>
-            <w:pPr>
-              <w:pStyle w:val="Standard"/>
-              <w:rPr>
-                <w:rFonts w:ascii="Arial" w:hAnsi="Arial"/>
-                <w:color w:val="555555"/>
-                <w:sz w:val="16"/>
-                <w:szCs w:val="16"/>
-                <w:lang w:val="fr-FR"/>
-              </w:rPr>
-            </w:pPr>
-            <w:r>
-              <w:rPr>
-                <w:rFonts w:ascii="Arial" w:hAnsi="Arial"/>
-                <w:color w:val="555555"/>
-                <w:sz w:val="16"/>
-                <w:szCs w:val="16"/>
-                <w:lang w:val="fr-FR"/>
-              </w:rPr>
-              <w:t>Cette pénalité court à compter de la date d'échéance jusqu'au jour du paiement</w:t>
-            </w:r>
-          </w:p>
-          <w:p>
-            <w:pPr>
-              <w:pStyle w:val="Standard"/>
+              <w:jc w:val="both"/>
               <w:rPr>
                 <w:rFonts w:ascii="Arial" w:hAnsi="Arial"/>
                 <w:color w:val="555555"/>
@@ -2694,8 +2716,6 @@
               </w:rPr>
               <w:t>13807 00720 32521557780 72</w:t>
             </w:r>
-            <w:bookmarkStart w:id="0" w:name="_GoBack"/>
-            <w:bookmarkEnd w:id="0"/>
           </w:p>
           <w:p>
             <w:pPr>
@@ -2735,7 +2755,17 @@
                 <w:sz w:val="16"/>
                 <w:lang w:val="fr-FR"/>
               </w:rPr>
-              <w:t>Domiciliation : BNP PARIBAS</w:t>
+              <w:t xml:space="preserve">Domiciliation : </w:t>
+            </w:r>
+            <w:r>
+              <w:rPr>
+                <w:rFonts w:ascii="Arial" w:hAnsi="Arial" w:cs="Arial"/>
+                <w:i/>
+                <w:sz w:val="16"/>
+                <w:szCs w:val="16"/>
+                <w:lang w:val="fr-FR"/>
+              </w:rPr>
+              <w:t>BPGO RENNES OCTROI</w:t>
             </w:r>
           </w:p>
           <w:p>
@@ -2816,6 +2846,7 @@
                 <w:rFonts w:ascii="Arial" w:hAnsi="Arial"/>
                 <w:color w:val="000000"/>
                 <w:sz w:val="16"/>
+                <w:szCs w:val="16"/>
                 <w:lang w:val="fr-FR"/>
               </w:rPr>
             </w:pPr>
@@ -2827,7 +2858,24 @@
                 <w:lang w:val="fr-FR"/>
               </w:rPr>
               <w:tab/>
-              <w:t>BIC : BNPAFRPPREN</w:t>
+            </w:r>
+            <w:r>
+              <w:rPr>
+                <w:rFonts w:ascii="Arial" w:hAnsi="Arial"/>
+                <w:color w:val="000000"/>
+                <w:sz w:val="16"/>
+                <w:szCs w:val="16"/>
+                <w:lang w:val="fr-FR"/>
+              </w:rPr>
+              <w:t xml:space="preserve">BIC : </w:t>
+            </w:r>
+            <w:r>
+              <w:rPr>
+                <w:rFonts w:ascii="Arial" w:hAnsi="Arial" w:cs="Arial"/>
+                <w:sz w:val="16"/>
+                <w:szCs w:val="16"/>
+              </w:rPr>
+              <w:t>CCBPFRPPNAN</w:t>
             </w:r>
           </w:p>
           <w:p>
@@ -3310,7 +3358,18 @@
                       <w:szCs w:val="18"/>
                       <w:lang w:val="fr-FR"/>
                     </w:rPr>
-                    <w:t>}},00%</w:t>
+                    <w:t>}}</w:t>
+                  </w:r>
+                  <w:r>
+                    <w:rPr>
+                      <w:rFonts w:ascii="Arial" w:hAnsi="Arial"/>
+                      <w:b/>
+                      <w:color w:val="555555"/>
+                      <w:sz w:val="16"/>
+                      <w:szCs w:val="18"/>
+                      <w:lang w:val="fr-FR"/>
+                    </w:rPr>
+                    <w:t>%</w:t>
                   </w:r>
                 </w:p>
               </w:tc>
@@ -3680,6 +3739,7 @@
               <w:tabs>
                 <w:tab w:val="left" w:pos="6240"/>
               </w:tabs>
+              <w:jc w:val="right"/>
               <w:rPr>
                 <w:rFonts w:ascii="Arial" w:hAnsi="Arial"/>
                 <w:b/>
@@ -3783,6 +3843,17 @@
                 <w:lang w:val="fr-FR"/>
               </w:rPr>
               <w:t xml:space="preserve"> }}</w:t>
+            </w:r>
+            <w:r>
+              <w:rPr>
+                <w:rFonts w:ascii="Arial" w:hAnsi="Arial"/>
+                <w:b/>
+                <w:color w:val="555555"/>
+                <w:sz w:val="18"/>
+                <w:szCs w:val="18"/>
+                <w:lang w:val="fr-FR"/>
+              </w:rPr>
+              <w:t xml:space="preserve"> euros.</w:t>
             </w:r>
           </w:p>
           <w:p>

</xml_diff>

<commit_message>
Write l'addresse de facturation in the doctype now
</commit_message>
<xml_diff>
--- a/flower_backend/doctypes/FA.docx
+++ b/flower_backend/doctypes/FA.docx
@@ -828,7 +828,6 @@
                 <w:rFonts w:ascii="Arial" w:hAnsi="Arial"/>
                 <w:sz w:val="18"/>
                 <w:szCs w:val="18"/>
-                <w:lang w:val="fr-FR"/>
               </w:rPr>
             </w:pPr>
             <w:r>
@@ -838,9 +837,8 @@
                 <w:szCs w:val="18"/>
                 <w:lang w:val="fr-FR"/>
               </w:rPr>
-              <w:t>{</w:t>
-            </w:r>
-            <w:proofErr w:type="gramStart"/>
+              <w:t>{{</w:t>
+            </w:r>
             <w:r>
               <w:rPr>
                 <w:rFonts w:ascii="Arial" w:hAnsi="Arial"/>
@@ -848,8 +846,9 @@
                 <w:szCs w:val="18"/>
                 <w:lang w:val="fr-FR"/>
               </w:rPr>
-              <w:t>{</w:t>
-            </w:r>
+              <w:t xml:space="preserve"> </w:t>
+            </w:r>
+            <w:proofErr w:type="spellStart"/>
             <w:r>
               <w:rPr>
                 <w:rFonts w:ascii="Arial" w:hAnsi="Arial"/>
@@ -857,9 +856,63 @@
                 <w:szCs w:val="18"/>
                 <w:lang w:val="fr-FR"/>
               </w:rPr>
+              <w:t>facture.</w:t>
+            </w:r>
+            <w:r>
+              <w:rPr>
+                <w:rFonts w:ascii="Arial" w:hAnsi="Arial"/>
+                <w:sz w:val="20"/>
+                <w:szCs w:val="18"/>
+                <w:lang w:val="fr-FR"/>
+              </w:rPr>
+              <w:t>payee</w:t>
+            </w:r>
+            <w:r>
+              <w:rPr>
+                <w:rFonts w:ascii="Arial" w:hAnsi="Arial"/>
+                <w:sz w:val="20"/>
+                <w:szCs w:val="18"/>
+                <w:lang w:val="fr-FR"/>
+              </w:rPr>
+              <w:t>.ad</w:t>
+            </w:r>
+            <w:r>
+              <w:rPr>
+                <w:rFonts w:ascii="Arial" w:hAnsi="Arial"/>
+                <w:sz w:val="20"/>
+                <w:szCs w:val="18"/>
+                <w:lang w:val="fr-FR"/>
+              </w:rPr>
+              <w:t>d</w:t>
+            </w:r>
+            <w:r>
+              <w:rPr>
+                <w:rFonts w:ascii="Arial" w:hAnsi="Arial"/>
+                <w:sz w:val="20"/>
+                <w:szCs w:val="18"/>
+                <w:lang w:val="fr-FR"/>
+              </w:rPr>
+              <w:t>ress</w:t>
+            </w:r>
+            <w:r>
+              <w:rPr>
+                <w:rFonts w:ascii="Arial" w:hAnsi="Arial"/>
+                <w:sz w:val="20"/>
+                <w:szCs w:val="18"/>
+                <w:lang w:val="fr-FR"/>
+              </w:rPr>
+              <w:t>e_facturation</w:t>
+            </w:r>
+            <w:proofErr w:type="spellEnd"/>
+            <w:r>
+              <w:rPr>
+                <w:rFonts w:ascii="Arial" w:hAnsi="Arial"/>
+                <w:sz w:val="20"/>
+                <w:szCs w:val="18"/>
+                <w:lang w:val="fr-FR"/>
+              </w:rPr>
               <w:t xml:space="preserve"> </w:t>
             </w:r>
-            <w:proofErr w:type="spellStart"/>
             <w:r>
               <w:rPr>
                 <w:rFonts w:ascii="Arial" w:hAnsi="Arial"/>
@@ -867,341 +920,10 @@
                 <w:szCs w:val="18"/>
                 <w:lang w:val="fr-FR"/>
               </w:rPr>
-              <w:t>facture.</w:t>
-            </w:r>
-            <w:r>
-              <w:rPr>
-                <w:rFonts w:ascii="Arial" w:hAnsi="Arial"/>
-                <w:sz w:val="20"/>
-                <w:szCs w:val="18"/>
-                <w:lang w:val="fr-FR"/>
-              </w:rPr>
-              <w:t>payee</w:t>
-            </w:r>
-            <w:r>
-              <w:rPr>
-                <w:rFonts w:ascii="Arial" w:hAnsi="Arial"/>
-                <w:sz w:val="20"/>
-                <w:szCs w:val="18"/>
-                <w:lang w:val="fr-FR"/>
-              </w:rPr>
-              <w:t>.ad</w:t>
-            </w:r>
-            <w:r>
-              <w:rPr>
-                <w:rFonts w:ascii="Arial" w:hAnsi="Arial"/>
-                <w:sz w:val="20"/>
-                <w:szCs w:val="18"/>
-                <w:lang w:val="fr-FR"/>
-              </w:rPr>
-              <w:t>d</w:t>
-            </w:r>
-            <w:r>
-              <w:rPr>
-                <w:rFonts w:ascii="Arial" w:hAnsi="Arial"/>
-                <w:sz w:val="20"/>
-                <w:szCs w:val="18"/>
-                <w:lang w:val="fr-FR"/>
-              </w:rPr>
-              <w:t>ress</w:t>
-            </w:r>
-            <w:proofErr w:type="spellEnd"/>
-            <w:proofErr w:type="gramEnd"/>
-            <w:r>
-              <w:rPr>
-                <w:rFonts w:ascii="Arial" w:hAnsi="Arial"/>
-                <w:sz w:val="20"/>
-                <w:szCs w:val="18"/>
-                <w:lang w:val="fr-FR"/>
-              </w:rPr>
-              <w:t xml:space="preserve"> </w:t>
-            </w:r>
-            <w:r>
-              <w:rPr>
-                <w:rFonts w:ascii="Arial" w:hAnsi="Arial"/>
-                <w:sz w:val="20"/>
-                <w:szCs w:val="18"/>
-                <w:lang w:val="fr-FR"/>
-              </w:rPr>
               <w:t>}}</w:t>
             </w:r>
-          </w:p>
-          <w:p>
-            <w:pPr>
-              <w:pStyle w:val="Standard"/>
-              <w:tabs>
-                <w:tab w:val="left" w:pos="6405"/>
-              </w:tabs>
-              <w:rPr>
-                <w:rFonts w:ascii="Arial" w:hAnsi="Arial"/>
-                <w:sz w:val="18"/>
-                <w:szCs w:val="18"/>
-                <w:lang w:val="fr-FR"/>
-              </w:rPr>
-            </w:pPr>
-            <w:r>
-              <w:rPr>
-                <w:rFonts w:ascii="Arial" w:hAnsi="Arial"/>
-                <w:sz w:val="20"/>
-                <w:szCs w:val="18"/>
-                <w:lang w:val="fr-FR"/>
-              </w:rPr>
-              <w:t>{</w:t>
-            </w:r>
-            <w:proofErr w:type="gramStart"/>
-            <w:r>
-              <w:rPr>
-                <w:rFonts w:ascii="Arial" w:hAnsi="Arial"/>
-                <w:sz w:val="20"/>
-                <w:szCs w:val="18"/>
-                <w:lang w:val="fr-FR"/>
-              </w:rPr>
-              <w:t>{</w:t>
-            </w:r>
-            <w:r>
-              <w:rPr>
-                <w:rFonts w:ascii="Arial" w:hAnsi="Arial"/>
-                <w:sz w:val="20"/>
-                <w:szCs w:val="18"/>
-                <w:lang w:val="fr-FR"/>
-              </w:rPr>
-              <w:t xml:space="preserve"> </w:t>
-            </w:r>
-            <w:proofErr w:type="spellStart"/>
-            <w:r>
-              <w:rPr>
-                <w:rFonts w:ascii="Arial" w:hAnsi="Arial"/>
-                <w:sz w:val="20"/>
-                <w:szCs w:val="18"/>
-                <w:lang w:val="fr-FR"/>
-              </w:rPr>
-              <w:t>facture.</w:t>
-            </w:r>
-            <w:r>
-              <w:rPr>
-                <w:rFonts w:ascii="Arial" w:hAnsi="Arial"/>
-                <w:sz w:val="20"/>
-                <w:szCs w:val="18"/>
-                <w:lang w:val="fr-FR"/>
-              </w:rPr>
-              <w:t>project</w:t>
-            </w:r>
-            <w:r>
-              <w:rPr>
-                <w:rFonts w:ascii="Arial" w:hAnsi="Arial"/>
-                <w:sz w:val="20"/>
-                <w:szCs w:val="18"/>
-                <w:lang w:val="fr-FR"/>
-              </w:rPr>
-              <w:t>.</w:t>
-            </w:r>
-            <w:r>
-              <w:rPr>
-                <w:rFonts w:ascii="Arial" w:hAnsi="Arial"/>
-                <w:sz w:val="20"/>
-                <w:szCs w:val="18"/>
-                <w:lang w:val="fr-FR"/>
-              </w:rPr>
-              <w:t>prospect.postcode</w:t>
-            </w:r>
-            <w:proofErr w:type="spellEnd"/>
-            <w:proofErr w:type="gramEnd"/>
-            <w:r>
-              <w:rPr>
-                <w:rFonts w:ascii="Arial" w:hAnsi="Arial"/>
-                <w:sz w:val="20"/>
-                <w:szCs w:val="18"/>
-                <w:lang w:val="fr-FR"/>
-              </w:rPr>
-              <w:t xml:space="preserve"> </w:t>
-            </w:r>
-            <w:r>
-              <w:rPr>
-                <w:rFonts w:ascii="Arial" w:hAnsi="Arial"/>
-                <w:sz w:val="20"/>
-                <w:szCs w:val="18"/>
-                <w:lang w:val="fr-FR"/>
-              </w:rPr>
-              <w:t>}}</w:t>
-            </w:r>
-            <w:r>
-              <w:rPr>
-                <w:rFonts w:ascii="Arial" w:hAnsi="Arial"/>
-                <w:sz w:val="20"/>
-                <w:szCs w:val="18"/>
-                <w:lang w:val="fr-FR"/>
-              </w:rPr>
-              <w:t xml:space="preserve"> </w:t>
-            </w:r>
-            <w:r>
-              <w:rPr>
-                <w:rFonts w:ascii="Arial" w:hAnsi="Arial"/>
-                <w:color w:val="000000"/>
-                <w:sz w:val="20"/>
-                <w:szCs w:val="18"/>
-                <w:lang w:val="fr-FR"/>
-              </w:rPr>
-              <w:t>{{</w:t>
-            </w:r>
-            <w:r>
-              <w:rPr>
-                <w:rFonts w:ascii="Arial" w:hAnsi="Arial"/>
-                <w:color w:val="000000"/>
-                <w:sz w:val="20"/>
-                <w:szCs w:val="18"/>
-                <w:lang w:val="fr-FR"/>
-              </w:rPr>
-              <w:t xml:space="preserve"> </w:t>
-            </w:r>
-            <w:proofErr w:type="spellStart"/>
-            <w:r>
-              <w:rPr>
-                <w:rFonts w:ascii="Arial" w:hAnsi="Arial"/>
-                <w:color w:val="000000"/>
-                <w:sz w:val="20"/>
-                <w:szCs w:val="18"/>
-                <w:lang w:val="fr-FR"/>
-              </w:rPr>
-              <w:t>facture</w:t>
-            </w:r>
-            <w:r>
-              <w:rPr>
-                <w:rFonts w:ascii="Arial" w:hAnsi="Arial"/>
-                <w:color w:val="000000"/>
-                <w:sz w:val="20"/>
-                <w:szCs w:val="18"/>
-                <w:lang w:val="fr-FR"/>
-              </w:rPr>
-              <w:t>.project</w:t>
-            </w:r>
-            <w:r>
-              <w:rPr>
-                <w:rFonts w:ascii="Arial" w:hAnsi="Arial"/>
-                <w:color w:val="000000"/>
-                <w:sz w:val="20"/>
-                <w:szCs w:val="18"/>
-                <w:lang w:val="fr-FR"/>
-              </w:rPr>
-              <w:t>.prospect.</w:t>
-            </w:r>
-            <w:r>
-              <w:rPr>
-                <w:rFonts w:ascii="Arial" w:hAnsi="Arial"/>
-                <w:color w:val="000000"/>
-                <w:sz w:val="20"/>
-                <w:szCs w:val="18"/>
-                <w:lang w:val="fr-FR"/>
-              </w:rPr>
-              <w:t>town</w:t>
-            </w:r>
-            <w:proofErr w:type="spellEnd"/>
-            <w:r>
-              <w:rPr>
-                <w:rFonts w:ascii="Arial" w:hAnsi="Arial"/>
-                <w:color w:val="000000"/>
-                <w:sz w:val="20"/>
-                <w:szCs w:val="18"/>
-                <w:lang w:val="fr-FR"/>
-              </w:rPr>
-              <w:t xml:space="preserve"> </w:t>
-            </w:r>
-            <w:r>
-              <w:rPr>
-                <w:rFonts w:ascii="Arial" w:hAnsi="Arial"/>
-                <w:color w:val="000000"/>
-                <w:sz w:val="20"/>
-                <w:szCs w:val="18"/>
-                <w:lang w:val="fr-FR"/>
-              </w:rPr>
-              <w:t>}}</w:t>
-            </w:r>
-          </w:p>
-          <w:p>
-            <w:pPr>
-              <w:pStyle w:val="Standard"/>
-              <w:tabs>
-                <w:tab w:val="left" w:pos="6405"/>
-              </w:tabs>
-              <w:rPr>
-                <w:rFonts w:ascii="Arial" w:hAnsi="Arial"/>
-                <w:sz w:val="18"/>
-                <w:szCs w:val="18"/>
-              </w:rPr>
-            </w:pPr>
-            <w:r>
-              <w:rPr>
-                <w:rFonts w:ascii="Arial" w:hAnsi="Arial"/>
-                <w:color w:val="000000"/>
-                <w:sz w:val="20"/>
-                <w:szCs w:val="18"/>
-              </w:rPr>
-              <w:t>{{</w:t>
-            </w:r>
-            <w:r>
-              <w:rPr>
-                <w:rFonts w:ascii="Arial" w:hAnsi="Arial"/>
-                <w:color w:val="000000"/>
-                <w:sz w:val="20"/>
-                <w:szCs w:val="18"/>
-              </w:rPr>
-              <w:t xml:space="preserve"> </w:t>
-            </w:r>
-            <w:proofErr w:type="spellStart"/>
-            <w:r>
-              <w:rPr>
-                <w:rFonts w:ascii="Arial" w:hAnsi="Arial"/>
-                <w:color w:val="000000"/>
-                <w:sz w:val="20"/>
-                <w:szCs w:val="18"/>
-              </w:rPr>
-              <w:t>facture.</w:t>
-            </w:r>
-            <w:r>
-              <w:rPr>
-                <w:rFonts w:ascii="Arial" w:hAnsi="Arial"/>
-                <w:color w:val="000000"/>
-                <w:sz w:val="20"/>
-                <w:szCs w:val="18"/>
-              </w:rPr>
-              <w:t>project</w:t>
-            </w:r>
-            <w:r>
-              <w:rPr>
-                <w:rFonts w:ascii="Arial" w:hAnsi="Arial"/>
-                <w:color w:val="000000"/>
-                <w:sz w:val="20"/>
-                <w:szCs w:val="18"/>
-              </w:rPr>
-              <w:t>.prospect.</w:t>
-            </w:r>
-            <w:r>
-              <w:rPr>
-                <w:rFonts w:ascii="Arial" w:hAnsi="Arial"/>
-                <w:color w:val="000000"/>
-                <w:sz w:val="20"/>
-                <w:szCs w:val="18"/>
-              </w:rPr>
-              <w:t>country</w:t>
-            </w:r>
-            <w:proofErr w:type="spellEnd"/>
-            <w:r>
-              <w:rPr>
-                <w:rFonts w:ascii="Arial" w:hAnsi="Arial"/>
-                <w:color w:val="000000"/>
-                <w:sz w:val="20"/>
-                <w:szCs w:val="18"/>
-              </w:rPr>
-              <w:t xml:space="preserve"> </w:t>
-            </w:r>
-            <w:r>
-              <w:rPr>
-                <w:rFonts w:ascii="Arial" w:hAnsi="Arial"/>
-                <w:color w:val="000000"/>
-                <w:sz w:val="20"/>
-                <w:szCs w:val="18"/>
-              </w:rPr>
-              <w:t>}}</w:t>
-            </w:r>
+            <w:bookmarkStart w:id="0" w:name="_GoBack"/>
+            <w:bookmarkEnd w:id="0"/>
           </w:p>
         </w:tc>
       </w:tr>
@@ -2570,8 +2292,6 @@
               </w:rPr>
               <w:t>d'intérêt légal en vigueur majoré de 10 points de pourcentage (appliqué au montant TTC). Et en application des articles L441-3 et L441-6 du code de commerce, il sera également appliqué une indemnité de recouvrement de 40 euros.</w:t>
             </w:r>
-            <w:bookmarkStart w:id="0" w:name="_GoBack"/>
-            <w:bookmarkEnd w:id="0"/>
           </w:p>
           <w:p>
             <w:pPr>

</xml_diff>

<commit_message>
Revert "Merge branch '80-maj-treso' into 'dev'"
This reverts merge request !87
</commit_message>
<xml_diff>
--- a/flower_backend/doctypes/FA.docx
+++ b/flower_backend/doctypes/FA.docx
@@ -828,6 +828,7 @@
                 <w:rFonts w:ascii="Arial" w:hAnsi="Arial"/>
                 <w:sz w:val="18"/>
                 <w:szCs w:val="18"/>
+                <w:lang w:val="fr-FR"/>
               </w:rPr>
             </w:pPr>
             <w:r>
@@ -837,11 +838,215 @@
                 <w:szCs w:val="18"/>
                 <w:lang w:val="fr-FR"/>
               </w:rPr>
+              <w:t>{</w:t>
+            </w:r>
+            <w:proofErr w:type="gramStart"/>
+            <w:r>
+              <w:rPr>
+                <w:rFonts w:ascii="Arial" w:hAnsi="Arial"/>
+                <w:sz w:val="20"/>
+                <w:szCs w:val="18"/>
+                <w:lang w:val="fr-FR"/>
+              </w:rPr>
+              <w:t>{</w:t>
+            </w:r>
+            <w:r>
+              <w:rPr>
+                <w:rFonts w:ascii="Arial" w:hAnsi="Arial"/>
+                <w:sz w:val="20"/>
+                <w:szCs w:val="18"/>
+                <w:lang w:val="fr-FR"/>
+              </w:rPr>
+              <w:t xml:space="preserve"> </w:t>
+            </w:r>
+            <w:proofErr w:type="spellStart"/>
+            <w:r>
+              <w:rPr>
+                <w:rFonts w:ascii="Arial" w:hAnsi="Arial"/>
+                <w:sz w:val="20"/>
+                <w:szCs w:val="18"/>
+                <w:lang w:val="fr-FR"/>
+              </w:rPr>
+              <w:t>facture.</w:t>
+            </w:r>
+            <w:r>
+              <w:rPr>
+                <w:rFonts w:ascii="Arial" w:hAnsi="Arial"/>
+                <w:sz w:val="20"/>
+                <w:szCs w:val="18"/>
+                <w:lang w:val="fr-FR"/>
+              </w:rPr>
+              <w:t>payee</w:t>
+            </w:r>
+            <w:r>
+              <w:rPr>
+                <w:rFonts w:ascii="Arial" w:hAnsi="Arial"/>
+                <w:sz w:val="20"/>
+                <w:szCs w:val="18"/>
+                <w:lang w:val="fr-FR"/>
+              </w:rPr>
+              <w:t>.ad</w:t>
+            </w:r>
+            <w:r>
+              <w:rPr>
+                <w:rFonts w:ascii="Arial" w:hAnsi="Arial"/>
+                <w:sz w:val="20"/>
+                <w:szCs w:val="18"/>
+                <w:lang w:val="fr-FR"/>
+              </w:rPr>
+              <w:t>d</w:t>
+            </w:r>
+            <w:r>
+              <w:rPr>
+                <w:rFonts w:ascii="Arial" w:hAnsi="Arial"/>
+                <w:sz w:val="20"/>
+                <w:szCs w:val="18"/>
+                <w:lang w:val="fr-FR"/>
+              </w:rPr>
+              <w:t>ress</w:t>
+            </w:r>
+            <w:proofErr w:type="spellEnd"/>
+            <w:proofErr w:type="gramEnd"/>
+            <w:r>
+              <w:rPr>
+                <w:rFonts w:ascii="Arial" w:hAnsi="Arial"/>
+                <w:sz w:val="20"/>
+                <w:szCs w:val="18"/>
+                <w:lang w:val="fr-FR"/>
+              </w:rPr>
+              <w:t xml:space="preserve"> </w:t>
+            </w:r>
+            <w:r>
+              <w:rPr>
+                <w:rFonts w:ascii="Arial" w:hAnsi="Arial"/>
+                <w:sz w:val="20"/>
+                <w:szCs w:val="18"/>
+                <w:lang w:val="fr-FR"/>
+              </w:rPr>
+              <w:t>}}</w:t>
+            </w:r>
+          </w:p>
+          <w:p>
+            <w:pPr>
+              <w:pStyle w:val="Standard"/>
+              <w:tabs>
+                <w:tab w:val="left" w:pos="6405"/>
+              </w:tabs>
+              <w:rPr>
+                <w:rFonts w:ascii="Arial" w:hAnsi="Arial"/>
+                <w:sz w:val="18"/>
+                <w:szCs w:val="18"/>
+                <w:lang w:val="fr-FR"/>
+              </w:rPr>
+            </w:pPr>
+            <w:r>
+              <w:rPr>
+                <w:rFonts w:ascii="Arial" w:hAnsi="Arial"/>
+                <w:sz w:val="20"/>
+                <w:szCs w:val="18"/>
+                <w:lang w:val="fr-FR"/>
+              </w:rPr>
+              <w:t>{</w:t>
+            </w:r>
+            <w:proofErr w:type="gramStart"/>
+            <w:r>
+              <w:rPr>
+                <w:rFonts w:ascii="Arial" w:hAnsi="Arial"/>
+                <w:sz w:val="20"/>
+                <w:szCs w:val="18"/>
+                <w:lang w:val="fr-FR"/>
+              </w:rPr>
+              <w:t>{</w:t>
+            </w:r>
+            <w:r>
+              <w:rPr>
+                <w:rFonts w:ascii="Arial" w:hAnsi="Arial"/>
+                <w:sz w:val="20"/>
+                <w:szCs w:val="18"/>
+                <w:lang w:val="fr-FR"/>
+              </w:rPr>
+              <w:t xml:space="preserve"> </w:t>
+            </w:r>
+            <w:proofErr w:type="spellStart"/>
+            <w:r>
+              <w:rPr>
+                <w:rFonts w:ascii="Arial" w:hAnsi="Arial"/>
+                <w:sz w:val="20"/>
+                <w:szCs w:val="18"/>
+                <w:lang w:val="fr-FR"/>
+              </w:rPr>
+              <w:t>facture.</w:t>
+            </w:r>
+            <w:r>
+              <w:rPr>
+                <w:rFonts w:ascii="Arial" w:hAnsi="Arial"/>
+                <w:sz w:val="20"/>
+                <w:szCs w:val="18"/>
+                <w:lang w:val="fr-FR"/>
+              </w:rPr>
+              <w:t>project</w:t>
+            </w:r>
+            <w:r>
+              <w:rPr>
+                <w:rFonts w:ascii="Arial" w:hAnsi="Arial"/>
+                <w:sz w:val="20"/>
+                <w:szCs w:val="18"/>
+                <w:lang w:val="fr-FR"/>
+              </w:rPr>
+              <w:t>.</w:t>
+            </w:r>
+            <w:r>
+              <w:rPr>
+                <w:rFonts w:ascii="Arial" w:hAnsi="Arial"/>
+                <w:sz w:val="20"/>
+                <w:szCs w:val="18"/>
+                <w:lang w:val="fr-FR"/>
+              </w:rPr>
+              <w:t>prospect.postcode</w:t>
+            </w:r>
+            <w:proofErr w:type="spellEnd"/>
+            <w:proofErr w:type="gramEnd"/>
+            <w:r>
+              <w:rPr>
+                <w:rFonts w:ascii="Arial" w:hAnsi="Arial"/>
+                <w:sz w:val="20"/>
+                <w:szCs w:val="18"/>
+                <w:lang w:val="fr-FR"/>
+              </w:rPr>
+              <w:t xml:space="preserve"> </w:t>
+            </w:r>
+            <w:r>
+              <w:rPr>
+                <w:rFonts w:ascii="Arial" w:hAnsi="Arial"/>
+                <w:sz w:val="20"/>
+                <w:szCs w:val="18"/>
+                <w:lang w:val="fr-FR"/>
+              </w:rPr>
+              <w:t>}}</w:t>
+            </w:r>
+            <w:r>
+              <w:rPr>
+                <w:rFonts w:ascii="Arial" w:hAnsi="Arial"/>
+                <w:sz w:val="20"/>
+                <w:szCs w:val="18"/>
+                <w:lang w:val="fr-FR"/>
+              </w:rPr>
+              <w:t xml:space="preserve"> </w:t>
+            </w:r>
+            <w:r>
+              <w:rPr>
+                <w:rFonts w:ascii="Arial" w:hAnsi="Arial"/>
+                <w:color w:val="000000"/>
+                <w:sz w:val="20"/>
+                <w:szCs w:val="18"/>
+                <w:lang w:val="fr-FR"/>
+              </w:rPr>
               <w:t>{{</w:t>
             </w:r>
             <w:r>
               <w:rPr>
                 <w:rFonts w:ascii="Arial" w:hAnsi="Arial"/>
+                <w:color w:val="000000"/>
                 <w:sz w:val="20"/>
                 <w:szCs w:val="18"/>
                 <w:lang w:val="fr-FR"/>
@@ -852,78 +1057,151 @@
             <w:r>
               <w:rPr>
                 <w:rFonts w:ascii="Arial" w:hAnsi="Arial"/>
-                <w:sz w:val="20"/>
-                <w:szCs w:val="18"/>
-                <w:lang w:val="fr-FR"/>
+                <w:color w:val="000000"/>
+                <w:sz w:val="20"/>
+                <w:szCs w:val="18"/>
+                <w:lang w:val="fr-FR"/>
+              </w:rPr>
+              <w:t>facture</w:t>
+            </w:r>
+            <w:r>
+              <w:rPr>
+                <w:rFonts w:ascii="Arial" w:hAnsi="Arial"/>
+                <w:color w:val="000000"/>
+                <w:sz w:val="20"/>
+                <w:szCs w:val="18"/>
+                <w:lang w:val="fr-FR"/>
+              </w:rPr>
+              <w:t>.project</w:t>
+            </w:r>
+            <w:r>
+              <w:rPr>
+                <w:rFonts w:ascii="Arial" w:hAnsi="Arial"/>
+                <w:color w:val="000000"/>
+                <w:sz w:val="20"/>
+                <w:szCs w:val="18"/>
+                <w:lang w:val="fr-FR"/>
+              </w:rPr>
+              <w:t>.prospect.</w:t>
+            </w:r>
+            <w:r>
+              <w:rPr>
+                <w:rFonts w:ascii="Arial" w:hAnsi="Arial"/>
+                <w:color w:val="000000"/>
+                <w:sz w:val="20"/>
+                <w:szCs w:val="18"/>
+                <w:lang w:val="fr-FR"/>
+              </w:rPr>
+              <w:t>town</w:t>
+            </w:r>
+            <w:proofErr w:type="spellEnd"/>
+            <w:r>
+              <w:rPr>
+                <w:rFonts w:ascii="Arial" w:hAnsi="Arial"/>
+                <w:color w:val="000000"/>
+                <w:sz w:val="20"/>
+                <w:szCs w:val="18"/>
+                <w:lang w:val="fr-FR"/>
+              </w:rPr>
+              <w:t xml:space="preserve"> </w:t>
+            </w:r>
+            <w:r>
+              <w:rPr>
+                <w:rFonts w:ascii="Arial" w:hAnsi="Arial"/>
+                <w:color w:val="000000"/>
+                <w:sz w:val="20"/>
+                <w:szCs w:val="18"/>
+                <w:lang w:val="fr-FR"/>
+              </w:rPr>
+              <w:t>}}</w:t>
+            </w:r>
+          </w:p>
+          <w:p>
+            <w:pPr>
+              <w:pStyle w:val="Standard"/>
+              <w:tabs>
+                <w:tab w:val="left" w:pos="6405"/>
+              </w:tabs>
+              <w:rPr>
+                <w:rFonts w:ascii="Arial" w:hAnsi="Arial"/>
+                <w:sz w:val="18"/>
+                <w:szCs w:val="18"/>
+              </w:rPr>
+            </w:pPr>
+            <w:r>
+              <w:rPr>
+                <w:rFonts w:ascii="Arial" w:hAnsi="Arial"/>
+                <w:color w:val="000000"/>
+                <w:sz w:val="20"/>
+                <w:szCs w:val="18"/>
+              </w:rPr>
+              <w:t>{{</w:t>
+            </w:r>
+            <w:r>
+              <w:rPr>
+                <w:rFonts w:ascii="Arial" w:hAnsi="Arial"/>
+                <w:color w:val="000000"/>
+                <w:sz w:val="20"/>
+                <w:szCs w:val="18"/>
+              </w:rPr>
+              <w:t xml:space="preserve"> </w:t>
+            </w:r>
+            <w:proofErr w:type="spellStart"/>
+            <w:r>
+              <w:rPr>
+                <w:rFonts w:ascii="Arial" w:hAnsi="Arial"/>
+                <w:color w:val="000000"/>
+                <w:sz w:val="20"/>
+                <w:szCs w:val="18"/>
               </w:rPr>
               <w:t>facture.</w:t>
             </w:r>
             <w:r>
               <w:rPr>
                 <w:rFonts w:ascii="Arial" w:hAnsi="Arial"/>
-                <w:sz w:val="20"/>
-                <w:szCs w:val="18"/>
-                <w:lang w:val="fr-FR"/>
-              </w:rPr>
-              <w:t>payee</w:t>
-            </w:r>
-            <w:r>
-              <w:rPr>
-                <w:rFonts w:ascii="Arial" w:hAnsi="Arial"/>
-                <w:sz w:val="20"/>
-                <w:szCs w:val="18"/>
-                <w:lang w:val="fr-FR"/>
-              </w:rPr>
-              <w:t>.ad</w:t>
-            </w:r>
-            <w:r>
-              <w:rPr>
-                <w:rFonts w:ascii="Arial" w:hAnsi="Arial"/>
-                <w:sz w:val="20"/>
-                <w:szCs w:val="18"/>
-                <w:lang w:val="fr-FR"/>
-              </w:rPr>
-              <w:t>d</w:t>
-            </w:r>
-            <w:r>
-              <w:rPr>
-                <w:rFonts w:ascii="Arial" w:hAnsi="Arial"/>
-                <w:sz w:val="20"/>
-                <w:szCs w:val="18"/>
-                <w:lang w:val="fr-FR"/>
-              </w:rPr>
-              <w:t>ress</w:t>
-            </w:r>
-            <w:r>
-              <w:rPr>
-                <w:rFonts w:ascii="Arial" w:hAnsi="Arial"/>
-                <w:sz w:val="20"/>
-                <w:szCs w:val="18"/>
-                <w:lang w:val="fr-FR"/>
-              </w:rPr>
-              <w:t>e_facturation</w:t>
+                <w:color w:val="000000"/>
+                <w:sz w:val="20"/>
+                <w:szCs w:val="18"/>
+              </w:rPr>
+              <w:t>project</w:t>
+            </w:r>
+            <w:r>
+              <w:rPr>
+                <w:rFonts w:ascii="Arial" w:hAnsi="Arial"/>
+                <w:color w:val="000000"/>
+                <w:sz w:val="20"/>
+                <w:szCs w:val="18"/>
+              </w:rPr>
+              <w:t>.prospect.</w:t>
+            </w:r>
+            <w:r>
+              <w:rPr>
+                <w:rFonts w:ascii="Arial" w:hAnsi="Arial"/>
+                <w:color w:val="000000"/>
+                <w:sz w:val="20"/>
+                <w:szCs w:val="18"/>
+              </w:rPr>
+              <w:t>country</w:t>
             </w:r>
             <w:proofErr w:type="spellEnd"/>
             <w:r>
               <w:rPr>
                 <w:rFonts w:ascii="Arial" w:hAnsi="Arial"/>
-                <w:sz w:val="20"/>
-                <w:szCs w:val="18"/>
-                <w:lang w:val="fr-FR"/>
+                <w:color w:val="000000"/>
+                <w:sz w:val="20"/>
+                <w:szCs w:val="18"/>
               </w:rPr>
               <w:t xml:space="preserve"> </w:t>
             </w:r>
             <w:r>
               <w:rPr>
                 <w:rFonts w:ascii="Arial" w:hAnsi="Arial"/>
-                <w:sz w:val="20"/>
-                <w:szCs w:val="18"/>
-                <w:lang w:val="fr-FR"/>
+                <w:color w:val="000000"/>
+                <w:sz w:val="20"/>
+                <w:szCs w:val="18"/>
               </w:rPr>
               <w:t>}}</w:t>
             </w:r>
-            <w:bookmarkStart w:id="0" w:name="_GoBack"/>
-            <w:bookmarkEnd w:id="0"/>
           </w:p>
         </w:tc>
       </w:tr>
@@ -2292,6 +2570,8 @@
               </w:rPr>
               <w:t>d'intérêt légal en vigueur majoré de 10 points de pourcentage (appliqué au montant TTC). Et en application des articles L441-3 et L441-6 du code de commerce, il sera également appliqué une indemnité de recouvrement de 40 euros.</w:t>
             </w:r>
+            <w:bookmarkStart w:id="0" w:name="_GoBack"/>
+            <w:bookmarkEnd w:id="0"/>
           </w:p>
           <w:p>
             <w:pPr>

</xml_diff>